<commit_message>
please give me mind
</commit_message>
<xml_diff>
--- a/7 семестр/ИСИС/ЛР 3/ИСИС ЛР 3.docx
+++ b/7 семестр/ИСИС/ЛР 3/ИСИС ЛР 3.docx
@@ -333,6 +333,9 @@
         <w:ind w:firstLine="0"/>
         <w:jc w:val="right"/>
       </w:pPr>
+      <w:r>
+        <w:t>Чернега В. С</w:t>
+      </w:r>
       <w:r>
         <w:t>.</w:t>
       </w:r>
@@ -476,13 +479,8 @@
     </w:p>
     <w:p>
       <w:r>
-        <w:t xml:space="preserve">Углубление теоретических знаний в области архитектуры компьютерных сетей и сетевых операционных систем, исследование способов трансляции сетевых адресов и приобретение навыков в построении и исследовании связи локальных сетей с глобальной средствами симулятора Cisco Packet </w:t>
-      </w:r>
-      <w:proofErr w:type="spellStart"/>
-      <w:r>
-        <w:t>Tracer</w:t>
-      </w:r>
-      <w:proofErr w:type="spellEnd"/>
+        <w:t>Углубление теоретических знаний в области архитектуры компьютерных сетей и сетевых операционных систем, исследование способов трансляции сетевых адресов и приобретение навыков в построении и исследовании связи локальных сетей с глобальной средствами симулятора Cisco Packet Tracer</w:t>
+      </w:r>
       <w:r>
         <w:t>.</w:t>
       </w:r>
@@ -534,15 +532,7 @@
         <w:ind w:hanging="578"/>
       </w:pPr>
       <w:r>
-        <w:t xml:space="preserve">Построить в окне эмулятора Packet </w:t>
-      </w:r>
-      <w:proofErr w:type="spellStart"/>
-      <w:r>
-        <w:t>Tracer</w:t>
-      </w:r>
-      <w:proofErr w:type="spellEnd"/>
-      <w:r>
-        <w:t xml:space="preserve"> локальную сеть, подключ</w:t>
+        <w:t>Построить в окне эмулятора Packet Tracer локальную сеть, подключ</w:t>
       </w:r>
       <w:r>
         <w:t>ё</w:t>
@@ -691,15 +681,7 @@
       </w:pPr>
       <w:r>
         <w:lastRenderedPageBreak/>
-        <w:t xml:space="preserve">Исследовать в режиме эмуляции Packet </w:t>
-      </w:r>
-      <w:proofErr w:type="spellStart"/>
-      <w:r>
-        <w:t>Tracer</w:t>
-      </w:r>
-      <w:proofErr w:type="spellEnd"/>
-      <w:r>
-        <w:t xml:space="preserve"> содержимое заголовков кадров и пакетов при отсутствии процедуры трансляции адресов</w:t>
+        <w:t>Исследовать в режиме эмуляции Packet Tracer содержимое заголовков кадров и пакетов при отсутствии процедуры трансляции адресов</w:t>
       </w:r>
       <w:r>
         <w:t>;</w:t>
@@ -728,15 +710,7 @@
         <w:ind w:hanging="578"/>
       </w:pPr>
       <w:r>
-        <w:t xml:space="preserve">Выполнить пингование сервера и компьютера провайдера при наличии трансляции адресов и исследовать заголовки кадров и пакетов в режиме эмуляции Packet </w:t>
-      </w:r>
-      <w:proofErr w:type="spellStart"/>
-      <w:r>
-        <w:t>Tracer</w:t>
-      </w:r>
-      <w:proofErr w:type="spellEnd"/>
-      <w:r>
-        <w:t>;</w:t>
+        <w:t>Выполнить пингование сервера и компьютера провайдера при наличии трансляции адресов и исследовать заголовки кадров и пакетов в режиме эмуляции Packet Tracer;</w:t>
       </w:r>
     </w:p>
     <w:p>
@@ -751,70 +725,14 @@
       <w:r>
         <w:t xml:space="preserve">Проверить таблицу трансляции адресов на маршрутизаторе локальной сети с помощью команды </w:t>
       </w:r>
-      <w:proofErr w:type="spellStart"/>
       <w:r>
         <w:rPr>
           <w:rFonts w:ascii="Courier New" w:hAnsi="Courier New" w:cs="Courier New"/>
           <w:sz w:val="20"/>
           <w:szCs w:val="16"/>
         </w:rPr>
-        <w:t>show</w:t>
-      </w:r>
-      <w:proofErr w:type="spellEnd"/>
-      <w:r>
-        <w:rPr>
-          <w:rFonts w:ascii="Courier New" w:hAnsi="Courier New" w:cs="Courier New"/>
-          <w:sz w:val="20"/>
-          <w:szCs w:val="16"/>
-        </w:rPr>
-        <w:t xml:space="preserve"> </w:t>
-      </w:r>
-      <w:proofErr w:type="spellStart"/>
-      <w:r>
-        <w:rPr>
-          <w:rFonts w:ascii="Courier New" w:hAnsi="Courier New" w:cs="Courier New"/>
-          <w:sz w:val="20"/>
-          <w:szCs w:val="16"/>
-        </w:rPr>
-        <w:t>ip</w:t>
-      </w:r>
-      <w:proofErr w:type="spellEnd"/>
-      <w:r>
-        <w:rPr>
-          <w:rFonts w:ascii="Courier New" w:hAnsi="Courier New" w:cs="Courier New"/>
-          <w:sz w:val="20"/>
-          <w:szCs w:val="16"/>
-        </w:rPr>
-        <w:t xml:space="preserve"> </w:t>
-      </w:r>
-      <w:proofErr w:type="spellStart"/>
-      <w:r>
-        <w:rPr>
-          <w:rFonts w:ascii="Courier New" w:hAnsi="Courier New" w:cs="Courier New"/>
-          <w:sz w:val="20"/>
-          <w:szCs w:val="16"/>
-        </w:rPr>
-        <w:t>nat</w:t>
-      </w:r>
-      <w:proofErr w:type="spellEnd"/>
-      <w:r>
-        <w:rPr>
-          <w:rFonts w:ascii="Courier New" w:hAnsi="Courier New" w:cs="Courier New"/>
-          <w:sz w:val="20"/>
-          <w:szCs w:val="16"/>
-        </w:rPr>
-        <w:t xml:space="preserve"> </w:t>
-      </w:r>
-      <w:proofErr w:type="spellStart"/>
-      <w:r>
-        <w:rPr>
-          <w:rFonts w:ascii="Courier New" w:hAnsi="Courier New" w:cs="Courier New"/>
-          <w:sz w:val="20"/>
-          <w:szCs w:val="16"/>
-        </w:rPr>
-        <w:t>translations</w:t>
-      </w:r>
-      <w:proofErr w:type="spellEnd"/>
+        <w:t>show ip nat translations</w:t>
+      </w:r>
       <w:r>
         <w:t>;</w:t>
       </w:r>
@@ -2229,15 +2147,7 @@
         <w:t xml:space="preserve"> </w:t>
       </w:r>
       <w:r>
-        <w:t xml:space="preserve">Packet </w:t>
-      </w:r>
-      <w:proofErr w:type="spellStart"/>
-      <w:r>
-        <w:t>Tracer</w:t>
-      </w:r>
-      <w:proofErr w:type="spellEnd"/>
-      <w:r>
-        <w:t xml:space="preserve"> </w:t>
+        <w:t xml:space="preserve">Packet Tracer </w:t>
       </w:r>
       <w:r>
         <w:t xml:space="preserve">был переключён </w:t>
@@ -2518,14 +2428,12 @@
       <w:r>
         <w:t xml:space="preserve">Интерфейс </w:t>
       </w:r>
-      <w:proofErr w:type="spellStart"/>
       <w:r>
         <w:rPr>
           <w:lang w:val="en-US"/>
         </w:rPr>
         <w:t>FastEthernet</w:t>
       </w:r>
-      <w:proofErr w:type="spellEnd"/>
       <w:r>
         <w:t xml:space="preserve">0/0 </w:t>
       </w:r>
@@ -2545,23 +2453,87 @@
         <w:rPr>
           <w:lang w:val="en-US"/>
         </w:rPr>
-        <w:t xml:space="preserve">Router0(config)#int </w:t>
-      </w:r>
-      <w:proofErr w:type="spellStart"/>
-      <w:r>
+        <w:t>Router0(config)#int FastEthernet 0/0</w:t>
+      </w:r>
+    </w:p>
+    <w:p>
+      <w:pPr>
+        <w:pStyle w:val="af"/>
         <w:rPr>
           <w:lang w:val="en-US"/>
         </w:rPr>
+      </w:pPr>
+      <w:r>
+        <w:rPr>
+          <w:lang w:val="en-US"/>
+        </w:rPr>
+        <w:t>Router0(config-</w:t>
+      </w:r>
+      <w:proofErr w:type="gramStart"/>
+      <w:r>
+        <w:rPr>
+          <w:lang w:val="en-US"/>
+        </w:rPr>
+        <w:t>if)#</w:t>
+      </w:r>
+      <w:proofErr w:type="gramEnd"/>
+      <w:r>
+        <w:rPr>
+          <w:lang w:val="en-US"/>
+        </w:rPr>
+        <w:t>ip nat inside</w:t>
+      </w:r>
+    </w:p>
+    <w:p>
+      <w:pPr>
+        <w:pStyle w:val="af"/>
+      </w:pPr>
+      <w:r>
+        <w:t>Router0(config-</w:t>
+      </w:r>
+      <w:proofErr w:type="gramStart"/>
+      <w:r>
+        <w:t>if)#</w:t>
+      </w:r>
+      <w:proofErr w:type="gramEnd"/>
+      <w:r>
+        <w:t>exit</w:t>
+      </w:r>
+    </w:p>
+    <w:p/>
+    <w:p>
+      <w:r>
+        <w:t xml:space="preserve">Интерфейс </w:t>
+      </w:r>
+      <w:r>
+        <w:rPr>
+          <w:lang w:val="en-US"/>
+        </w:rPr>
         <w:t>FastEthernet</w:t>
       </w:r>
-      <w:proofErr w:type="spellEnd"/>
+      <w:r>
+        <w:t xml:space="preserve">0/1, </w:t>
+      </w:r>
+      <w:r>
+        <w:t>подключённый</w:t>
+      </w:r>
+      <w:r>
+        <w:t xml:space="preserve"> </w:t>
+      </w:r>
+      <w:r>
+        <w:t xml:space="preserve">к внешним устройствам, был инициализирован как внешний интерфейс </w:t>
+      </w:r>
       <w:r>
         <w:rPr>
           <w:lang w:val="en-US"/>
         </w:rPr>
-        <w:t xml:space="preserve"> 0/0</w:t>
-      </w:r>
-    </w:p>
+        <w:t>NAT</w:t>
+      </w:r>
+      <w:r>
+        <w:t>.</w:t>
+      </w:r>
+    </w:p>
+    <w:p/>
     <w:p>
       <w:pPr>
         <w:pStyle w:val="af"/>
@@ -2573,21 +2545,35 @@
         <w:rPr>
           <w:lang w:val="en-US"/>
         </w:rPr>
-        <w:t xml:space="preserve">Router0(config-if)#ip </w:t>
-      </w:r>
-      <w:proofErr w:type="spellStart"/>
-      <w:r>
+        <w:t>Router0(config)#int FastEthernet 0/1</w:t>
+      </w:r>
+    </w:p>
+    <w:p>
+      <w:pPr>
+        <w:pStyle w:val="af"/>
         <w:rPr>
           <w:lang w:val="en-US"/>
         </w:rPr>
-        <w:t>nat</w:t>
-      </w:r>
-      <w:proofErr w:type="spellEnd"/>
+      </w:pPr>
       <w:r>
         <w:rPr>
           <w:lang w:val="en-US"/>
         </w:rPr>
-        <w:t xml:space="preserve"> inside</w:t>
+        <w:t>Router0(config-</w:t>
+      </w:r>
+      <w:proofErr w:type="gramStart"/>
+      <w:r>
+        <w:rPr>
+          <w:lang w:val="en-US"/>
+        </w:rPr>
+        <w:t>if)#</w:t>
+      </w:r>
+      <w:proofErr w:type="gramEnd"/>
+      <w:r>
+        <w:rPr>
+          <w:lang w:val="en-US"/>
+        </w:rPr>
+        <w:t>ip nat outside</w:t>
       </w:r>
     </w:p>
     <w:p>
@@ -2595,50 +2581,93 @@
         <w:pStyle w:val="af"/>
       </w:pPr>
       <w:r>
-        <w:t>Router0(</w:t>
-      </w:r>
-      <w:proofErr w:type="spellStart"/>
-      <w:r>
-        <w:t>config-if</w:t>
-      </w:r>
-      <w:proofErr w:type="spellEnd"/>
-      <w:r>
-        <w:t>)#exit</w:t>
+        <w:t>Router0(config-</w:t>
+      </w:r>
+      <w:proofErr w:type="gramStart"/>
+      <w:r>
+        <w:t>if)#</w:t>
+      </w:r>
+      <w:proofErr w:type="gramEnd"/>
+      <w:r>
+        <w:t>exit</w:t>
       </w:r>
     </w:p>
     <w:p/>
     <w:p>
       <w:r>
-        <w:t xml:space="preserve">Интерфейс </w:t>
-      </w:r>
-      <w:proofErr w:type="spellStart"/>
-      <w:r>
+        <w:t xml:space="preserve">Затем был задан </w:t>
+      </w:r>
+      <w:r>
+        <w:t>пул внешних адресов</w:t>
+      </w:r>
+      <w:r>
+        <w:t xml:space="preserve"> </w:t>
+      </w:r>
+      <w:r>
+        <w:t>–</w:t>
+      </w:r>
+      <w:r>
+        <w:t xml:space="preserve"> </w:t>
+      </w:r>
+      <w:r>
+        <w:t>единственный адрес 11.0.0.1. Таким образом в качестве внутреннего глобального адреса</w:t>
+      </w:r>
+      <w:r>
+        <w:t xml:space="preserve"> для трансляции</w:t>
+      </w:r>
+      <w:r>
+        <w:t xml:space="preserve"> маршрутизатор использует </w:t>
+      </w:r>
+      <w:r>
+        <w:t>свой</w:t>
+      </w:r>
+      <w:r>
+        <w:t xml:space="preserve"> внешн</w:t>
+      </w:r>
+      <w:r>
+        <w:t>ий</w:t>
+      </w:r>
+      <w:r>
+        <w:t xml:space="preserve"> интерфейс.</w:t>
+      </w:r>
+    </w:p>
+    <w:p/>
+    <w:p>
+      <w:pPr>
+        <w:pStyle w:val="af"/>
         <w:rPr>
           <w:lang w:val="en-US"/>
         </w:rPr>
-        <w:t>FastEthernet</w:t>
-      </w:r>
-      <w:proofErr w:type="spellEnd"/>
-      <w:r>
-        <w:t xml:space="preserve">0/1, </w:t>
-      </w:r>
-      <w:r>
-        <w:t>подключённый</w:t>
-      </w:r>
-      <w:r>
-        <w:t xml:space="preserve"> </w:t>
-      </w:r>
-      <w:r>
-        <w:t xml:space="preserve">к внешним устройствам, был инициализирован как внешний интерфейс </w:t>
-      </w:r>
+      </w:pPr>
       <w:r>
         <w:rPr>
           <w:lang w:val="en-US"/>
         </w:rPr>
-        <w:t>NAT</w:t>
-      </w:r>
-      <w:r>
-        <w:t>.</w:t>
+        <w:t>Router0(config)#</w:t>
+      </w:r>
+      <w:r>
+        <w:rPr>
+          <w:lang w:val="en-US"/>
+        </w:rPr>
+        <w:t>ip nat pool natpool 11.0.0.1 11.0.0.1 netmask 255.0.0.0</w:t>
+      </w:r>
+    </w:p>
+    <w:p>
+      <w:pPr>
+        <w:rPr>
+          <w:lang w:val="en-US"/>
+        </w:rPr>
+      </w:pPr>
+    </w:p>
+    <w:p>
+      <w:r>
+        <w:t xml:space="preserve">Был составлен список </w:t>
+      </w:r>
+      <w:r>
+        <w:t>доступа – трансляции подлежат любые внутренние адреса. На основе этого списка была установлена динамическая трансляция</w:t>
+      </w:r>
+      <w:r>
+        <w:t xml:space="preserve"> всех частных пакетов в адрес 11.0.0.1 способом перегрузки.</w:t>
       </w:r>
     </w:p>
     <w:p/>
@@ -2653,228 +2682,21 @@
         <w:rPr>
           <w:lang w:val="en-US"/>
         </w:rPr>
-        <w:t xml:space="preserve">Router0(config)#int </w:t>
-      </w:r>
-      <w:proofErr w:type="spellStart"/>
-      <w:r>
+        <w:t>Router0(config)#access-list 1 permit any</w:t>
+      </w:r>
+    </w:p>
+    <w:p>
+      <w:pPr>
+        <w:pStyle w:val="af"/>
         <w:rPr>
           <w:lang w:val="en-US"/>
         </w:rPr>
-        <w:t>FastEthernet</w:t>
-      </w:r>
-      <w:proofErr w:type="spellEnd"/>
+      </w:pPr>
       <w:r>
         <w:rPr>
           <w:lang w:val="en-US"/>
         </w:rPr>
-        <w:t xml:space="preserve"> 0/1</w:t>
-      </w:r>
-    </w:p>
-    <w:p>
-      <w:pPr>
-        <w:pStyle w:val="af"/>
-        <w:rPr>
-          <w:lang w:val="en-US"/>
-        </w:rPr>
-      </w:pPr>
-      <w:r>
-        <w:rPr>
-          <w:lang w:val="en-US"/>
-        </w:rPr>
-        <w:t xml:space="preserve">Router0(config-if)#ip </w:t>
-      </w:r>
-      <w:proofErr w:type="spellStart"/>
-      <w:r>
-        <w:rPr>
-          <w:lang w:val="en-US"/>
-        </w:rPr>
-        <w:t>nat</w:t>
-      </w:r>
-      <w:proofErr w:type="spellEnd"/>
-      <w:r>
-        <w:rPr>
-          <w:lang w:val="en-US"/>
-        </w:rPr>
-        <w:t xml:space="preserve"> outside</w:t>
-      </w:r>
-    </w:p>
-    <w:p>
-      <w:pPr>
-        <w:pStyle w:val="af"/>
-      </w:pPr>
-      <w:r>
-        <w:t>Router0(</w:t>
-      </w:r>
-      <w:proofErr w:type="spellStart"/>
-      <w:r>
-        <w:t>config-if</w:t>
-      </w:r>
-      <w:proofErr w:type="spellEnd"/>
-      <w:r>
-        <w:t>)#exit</w:t>
-      </w:r>
-    </w:p>
-    <w:p/>
-    <w:p>
-      <w:r>
-        <w:t xml:space="preserve">Затем был задан </w:t>
-      </w:r>
-      <w:r>
-        <w:t>пул внешних адресов</w:t>
-      </w:r>
-      <w:r>
-        <w:t xml:space="preserve"> </w:t>
-      </w:r>
-      <w:r>
-        <w:t>–</w:t>
-      </w:r>
-      <w:r>
-        <w:t xml:space="preserve"> </w:t>
-      </w:r>
-      <w:r>
-        <w:t>единственный адрес 11.0.0.1. Таким образом в качестве внутреннего глобального адреса</w:t>
-      </w:r>
-      <w:r>
-        <w:t xml:space="preserve"> для трансляции</w:t>
-      </w:r>
-      <w:r>
-        <w:t xml:space="preserve"> маршрутизатор использует </w:t>
-      </w:r>
-      <w:r>
-        <w:t>свой</w:t>
-      </w:r>
-      <w:r>
-        <w:t xml:space="preserve"> внешн</w:t>
-      </w:r>
-      <w:r>
-        <w:t>ий</w:t>
-      </w:r>
-      <w:r>
-        <w:t xml:space="preserve"> интерфейс.</w:t>
-      </w:r>
-    </w:p>
-    <w:p/>
-    <w:p>
-      <w:pPr>
-        <w:pStyle w:val="af"/>
-        <w:rPr>
-          <w:lang w:val="en-US"/>
-        </w:rPr>
-      </w:pPr>
-      <w:r>
-        <w:rPr>
-          <w:lang w:val="en-US"/>
-        </w:rPr>
-        <w:t>Router0(config)#</w:t>
-      </w:r>
-      <w:r>
-        <w:rPr>
-          <w:lang w:val="en-US"/>
-        </w:rPr>
-        <w:t xml:space="preserve">ip </w:t>
-      </w:r>
-      <w:proofErr w:type="spellStart"/>
-      <w:r>
-        <w:rPr>
-          <w:lang w:val="en-US"/>
-        </w:rPr>
-        <w:t>nat</w:t>
-      </w:r>
-      <w:proofErr w:type="spellEnd"/>
-      <w:r>
-        <w:rPr>
-          <w:lang w:val="en-US"/>
-        </w:rPr>
-        <w:t xml:space="preserve"> pool </w:t>
-      </w:r>
-      <w:proofErr w:type="spellStart"/>
-      <w:r>
-        <w:rPr>
-          <w:lang w:val="en-US"/>
-        </w:rPr>
-        <w:t>natpool</w:t>
-      </w:r>
-      <w:proofErr w:type="spellEnd"/>
-      <w:r>
-        <w:rPr>
-          <w:lang w:val="en-US"/>
-        </w:rPr>
-        <w:t xml:space="preserve"> 11.0.0.1 11.0.0.1 netmask 255.0.0.0</w:t>
-      </w:r>
-    </w:p>
-    <w:p>
-      <w:pPr>
-        <w:rPr>
-          <w:lang w:val="en-US"/>
-        </w:rPr>
-      </w:pPr>
-    </w:p>
-    <w:p>
-      <w:r>
-        <w:t xml:space="preserve">Был составлен список </w:t>
-      </w:r>
-      <w:r>
-        <w:t>доступа – трансляции подлежат любые внутренние адреса. На основе этого списка была установлена динамическая трансляция</w:t>
-      </w:r>
-      <w:r>
-        <w:t xml:space="preserve"> всех частных пакетов в адрес 11.0.0.1 способом перегрузки.</w:t>
-      </w:r>
-    </w:p>
-    <w:p/>
-    <w:p>
-      <w:pPr>
-        <w:pStyle w:val="af"/>
-        <w:rPr>
-          <w:lang w:val="en-US"/>
-        </w:rPr>
-      </w:pPr>
-      <w:r>
-        <w:rPr>
-          <w:lang w:val="en-US"/>
-        </w:rPr>
-        <w:t>Router0(config)#access-list 1 permit any</w:t>
-      </w:r>
-    </w:p>
-    <w:p>
-      <w:pPr>
-        <w:pStyle w:val="af"/>
-        <w:rPr>
-          <w:lang w:val="en-US"/>
-        </w:rPr>
-      </w:pPr>
-      <w:r>
-        <w:rPr>
-          <w:lang w:val="en-US"/>
-        </w:rPr>
-        <w:t xml:space="preserve">Router0(config)#ip </w:t>
-      </w:r>
-      <w:proofErr w:type="spellStart"/>
-      <w:r>
-        <w:rPr>
-          <w:lang w:val="en-US"/>
-        </w:rPr>
-        <w:t>nat</w:t>
-      </w:r>
-      <w:proofErr w:type="spellEnd"/>
-      <w:r>
-        <w:rPr>
-          <w:lang w:val="en-US"/>
-        </w:rPr>
-        <w:t xml:space="preserve"> inside source list 1 pool </w:t>
-      </w:r>
-      <w:proofErr w:type="spellStart"/>
-      <w:r>
-        <w:rPr>
-          <w:lang w:val="en-US"/>
-        </w:rPr>
-        <w:t>natpool</w:t>
-      </w:r>
-      <w:proofErr w:type="spellEnd"/>
-      <w:r>
-        <w:rPr>
-          <w:lang w:val="en-US"/>
-        </w:rPr>
-        <w:t xml:space="preserve"> overload</w:t>
+        <w:t>Router0(config)#ip nat inside source list 1 pool natpool overload</w:t>
       </w:r>
     </w:p>
     <w:p>

</xml_diff>